<commit_message>
Refactor document placeholder replacement into `doc_helpers.py`, update database connection details, adjust UI styling, and standardize date formats.
</commit_message>
<xml_diff>
--- a/Template files/الحكم - نفقة زوجة.docx
+++ b/Template files/الحكم - نفقة زوجة.docx
@@ -10,8 +10,6 @@
           <w:rtl/>
         </w:rPr>
       </w:pPr>
-      <w:bookmarkStart w:id="0" w:name="_GoBack"/>
-      <w:bookmarkEnd w:id="0"/>
       <w:r>
         <w:rPr>
           <w:rFonts w:cs="Arial"/>
@@ -86,6 +84,7 @@
     <w:p>
       <w:pPr>
         <w:rPr>
+          <w:rFonts w:asciiTheme="minorBidi" w:hAnsiTheme="minorBidi"/>
           <w:sz w:val="28"/>
           <w:szCs w:val="28"/>
           <w:rtl/>
@@ -93,53 +92,18 @@
       </w:pPr>
       <w:r>
         <w:rPr>
-          <w:rFonts w:cs="Arial"/>
-          <w:sz w:val="28"/>
-          <w:szCs w:val="28"/>
-          <w:rtl/>
-        </w:rPr>
-        <w:t xml:space="preserve">بناء على الدعوى والطلب والإقرار والتراضي وعملا </w:t>
-      </w:r>
-      <w:r>
-        <w:rPr>
-          <w:rFonts w:cs="Arial" w:hint="cs"/>
-          <w:sz w:val="28"/>
-          <w:szCs w:val="28"/>
-          <w:rtl/>
-        </w:rPr>
-        <w:t>بالمواد،</w:t>
-      </w:r>
-      <w:r>
-        <w:rPr>
-          <w:rFonts w:cs="Arial"/>
-          <w:sz w:val="28"/>
-          <w:szCs w:val="28"/>
-          <w:rtl/>
-        </w:rPr>
-        <w:t xml:space="preserve"> ٣٩،٣٨،١٨،١٦من قانون أصول المحاكمات الشرعية </w:t>
-      </w:r>
-      <w:r>
-        <w:rPr>
-          <w:rFonts w:cs="Arial" w:hint="cs"/>
-          <w:sz w:val="28"/>
-          <w:szCs w:val="28"/>
-          <w:rtl/>
-        </w:rPr>
-        <w:t>و١٦١،١٦٠ من</w:t>
-      </w:r>
-      <w:r>
-        <w:rPr>
-          <w:rFonts w:cs="Arial"/>
-          <w:sz w:val="28"/>
-          <w:szCs w:val="28"/>
-          <w:rtl/>
-        </w:rPr>
-        <w:t xml:space="preserve"> قانون الأحوال الشخصية و٥٩،٥٧،٣٨ من</w:t>
+          <w:rFonts w:asciiTheme="minorBidi" w:hAnsiTheme="minorBidi"/>
+          <w:sz w:val="28"/>
+          <w:szCs w:val="28"/>
+          <w:rtl/>
+        </w:rPr>
+        <w:t>بناء على الدعوى والطلب والإقرار والتراضي وعملا بالمواد، ٣٩،٣٨،١٨،١٦من قانون أصول المحاكمات الشرعية و١٦١،١٦٠ من قانون الأحوال الشخصية و٥٩،٥٧،٣٨ من</w:t>
       </w:r>
     </w:p>
     <w:p>
       <w:pPr>
         <w:rPr>
+          <w:rFonts w:asciiTheme="minorBidi" w:hAnsiTheme="minorBidi"/>
           <w:sz w:val="28"/>
           <w:szCs w:val="28"/>
           <w:rtl/>
@@ -147,52 +111,16 @@
       </w:pPr>
       <w:r>
         <w:rPr>
-          <w:rFonts w:cs="Arial"/>
-          <w:sz w:val="28"/>
-          <w:szCs w:val="28"/>
-          <w:rtl/>
-        </w:rPr>
-        <w:t>من</w:t>
-      </w:r>
-      <w:r>
-        <w:rPr>
-          <w:rFonts w:hint="cs"/>
-          <w:sz w:val="28"/>
-          <w:szCs w:val="28"/>
-          <w:rtl/>
-        </w:rPr>
-        <w:t xml:space="preserve"> </w:t>
-      </w:r>
-      <w:r>
-        <w:rPr>
-          <w:rFonts w:cs="Arial"/>
-          <w:sz w:val="28"/>
-          <w:szCs w:val="28"/>
-          <w:rtl/>
-        </w:rPr>
-        <w:t xml:space="preserve">قانون حقوق </w:t>
-      </w:r>
-      <w:r>
-        <w:rPr>
-          <w:rFonts w:cs="Arial" w:hint="cs"/>
-          <w:sz w:val="28"/>
-          <w:szCs w:val="28"/>
-          <w:rtl/>
-        </w:rPr>
-        <w:t>العائلة،</w:t>
-      </w:r>
-      <w:r>
-        <w:rPr>
-          <w:rFonts w:cs="Arial"/>
-          <w:sz w:val="28"/>
-          <w:szCs w:val="28"/>
-          <w:rtl/>
-        </w:rPr>
-        <w:t xml:space="preserve"> فقد حكمت بإلزام المدعى عليه </w:t>
-      </w:r>
-      <w:r>
-        <w:rPr>
-          <w:rFonts w:cs="Arial"/>
+          <w:rFonts w:asciiTheme="minorBidi" w:hAnsiTheme="minorBidi"/>
+          <w:sz w:val="28"/>
+          <w:szCs w:val="28"/>
+          <w:rtl/>
+        </w:rPr>
+        <w:t xml:space="preserve">من قانون حقوق العائلة، فقد حكمت بإلزام المدعى عليه </w:t>
+      </w:r>
+      <w:r>
+        <w:rPr>
+          <w:rFonts w:asciiTheme="minorBidi" w:hAnsiTheme="minorBidi"/>
           <w:sz w:val="28"/>
           <w:szCs w:val="28"/>
         </w:rPr>
@@ -200,25 +128,36 @@
       </w:r>
       <w:r>
         <w:rPr>
-          <w:rFonts w:cs="Arial" w:hint="cs"/>
-          <w:sz w:val="28"/>
-          <w:szCs w:val="28"/>
-          <w:rtl/>
-        </w:rPr>
-        <w:t xml:space="preserve"> </w:t>
-      </w:r>
-      <w:r>
-        <w:rPr>
-          <w:rFonts w:cs="Arial"/>
-          <w:sz w:val="28"/>
-          <w:szCs w:val="28"/>
-          <w:rtl/>
-        </w:rPr>
-        <w:t xml:space="preserve">المذكور بما فرض على نفسه نفقة شرعية لزوجته المدعية </w:t>
-      </w:r>
-      <w:r>
-        <w:rPr>
-          <w:rFonts w:cs="Arial"/>
+          <w:rFonts w:asciiTheme="minorBidi" w:hAnsiTheme="minorBidi"/>
+          <w:sz w:val="28"/>
+          <w:szCs w:val="28"/>
+          <w:rtl/>
+        </w:rPr>
+        <w:t xml:space="preserve"> </w:t>
+      </w:r>
+      <w:r>
+        <w:rPr>
+          <w:rFonts w:asciiTheme="minorBidi" w:hAnsiTheme="minorBidi"/>
+          <w:sz w:val="28"/>
+          <w:szCs w:val="28"/>
+          <w:rtl/>
+        </w:rPr>
+        <w:t>ال</w:t>
+      </w:r>
+      <w:bookmarkStart w:id="0" w:name="_GoBack"/>
+      <w:bookmarkEnd w:id="0"/>
+      <w:r>
+        <w:rPr>
+          <w:rFonts w:asciiTheme="minorBidi" w:hAnsiTheme="minorBidi"/>
+          <w:sz w:val="28"/>
+          <w:szCs w:val="28"/>
+          <w:rtl/>
+        </w:rPr>
+        <w:t xml:space="preserve">مذكور بما فرض على نفسه نفقة شرعية لزوجته المدعية </w:t>
+      </w:r>
+      <w:r>
+        <w:rPr>
+          <w:rFonts w:asciiTheme="minorBidi" w:hAnsiTheme="minorBidi"/>
           <w:sz w:val="28"/>
           <w:szCs w:val="28"/>
         </w:rPr>
@@ -226,16 +165,16 @@
       </w:r>
       <w:r>
         <w:rPr>
-          <w:rFonts w:cs="Arial" w:hint="cs"/>
-          <w:sz w:val="28"/>
-          <w:szCs w:val="28"/>
-          <w:rtl/>
-        </w:rPr>
-        <w:t xml:space="preserve"> </w:t>
-      </w:r>
-      <w:r>
-        <w:rPr>
-          <w:rFonts w:cs="Arial"/>
+          <w:rFonts w:asciiTheme="minorBidi" w:hAnsiTheme="minorBidi"/>
+          <w:sz w:val="28"/>
+          <w:szCs w:val="28"/>
+          <w:rtl/>
+        </w:rPr>
+        <w:t xml:space="preserve"> </w:t>
+      </w:r>
+      <w:r>
+        <w:rPr>
+          <w:rFonts w:asciiTheme="minorBidi" w:hAnsiTheme="minorBidi"/>
           <w:sz w:val="28"/>
           <w:szCs w:val="28"/>
           <w:rtl/>
@@ -244,7 +183,7 @@
       </w:r>
       <w:r>
         <w:rPr>
-          <w:rFonts w:cs="Arial"/>
+          <w:rFonts w:asciiTheme="minorBidi" w:hAnsiTheme="minorBidi"/>
           <w:sz w:val="28"/>
           <w:szCs w:val="28"/>
         </w:rPr>
@@ -252,16 +191,16 @@
       </w:r>
       <w:r>
         <w:rPr>
-          <w:rFonts w:cs="Arial" w:hint="cs"/>
-          <w:sz w:val="28"/>
-          <w:szCs w:val="28"/>
-          <w:rtl/>
-        </w:rPr>
-        <w:t xml:space="preserve"> </w:t>
-      </w:r>
-      <w:r>
-        <w:rPr>
-          <w:rFonts w:cs="Arial"/>
+          <w:rFonts w:asciiTheme="minorBidi" w:hAnsiTheme="minorBidi"/>
+          <w:sz w:val="28"/>
+          <w:szCs w:val="28"/>
+          <w:rtl/>
+        </w:rPr>
+        <w:t xml:space="preserve"> </w:t>
+      </w:r>
+      <w:r>
+        <w:rPr>
+          <w:rFonts w:asciiTheme="minorBidi" w:hAnsiTheme="minorBidi"/>
           <w:sz w:val="28"/>
           <w:szCs w:val="28"/>
           <w:rtl/>
@@ -270,7 +209,7 @@
       </w:r>
       <w:r>
         <w:rPr>
-          <w:rFonts w:cs="Arial" w:hint="cs"/>
+          <w:rFonts w:asciiTheme="minorBidi" w:hAnsiTheme="minorBidi"/>
           <w:sz w:val="28"/>
           <w:szCs w:val="28"/>
           <w:rtl/>
@@ -279,7 +218,7 @@
       </w:r>
       <w:r>
         <w:rPr>
-          <w:rFonts w:cs="Arial"/>
+          <w:rFonts w:asciiTheme="minorBidi" w:hAnsiTheme="minorBidi"/>
           <w:sz w:val="28"/>
           <w:szCs w:val="28"/>
           <w:rtl/>
@@ -288,7 +227,7 @@
       </w:r>
       <w:r>
         <w:rPr>
-          <w:rFonts w:cs="Arial"/>
+          <w:rFonts w:asciiTheme="minorBidi" w:hAnsiTheme="minorBidi"/>
           <w:sz w:val="28"/>
           <w:szCs w:val="28"/>
         </w:rPr>
@@ -296,16 +235,16 @@
       </w:r>
       <w:r>
         <w:rPr>
-          <w:rFonts w:cs="Arial" w:hint="cs"/>
-          <w:sz w:val="28"/>
-          <w:szCs w:val="28"/>
-          <w:rtl/>
-        </w:rPr>
-        <w:t xml:space="preserve"> </w:t>
-      </w:r>
-      <w:r>
-        <w:rPr>
-          <w:rFonts w:cs="Arial"/>
+          <w:rFonts w:asciiTheme="minorBidi" w:hAnsiTheme="minorBidi"/>
+          <w:sz w:val="28"/>
+          <w:szCs w:val="28"/>
+          <w:rtl/>
+        </w:rPr>
+        <w:t xml:space="preserve"> </w:t>
+      </w:r>
+      <w:r>
+        <w:rPr>
+          <w:rFonts w:asciiTheme="minorBidi" w:hAnsiTheme="minorBidi"/>
           <w:sz w:val="28"/>
           <w:szCs w:val="28"/>
           <w:rtl/>
@@ -314,7 +253,7 @@
       </w:r>
       <w:r>
         <w:rPr>
-          <w:rFonts w:cs="Arial" w:hint="cs"/>
+          <w:rFonts w:asciiTheme="minorBidi" w:hAnsiTheme="minorBidi"/>
           <w:sz w:val="28"/>
           <w:szCs w:val="28"/>
           <w:rtl/>
@@ -323,52 +262,16 @@
       </w:r>
       <w:r>
         <w:rPr>
-          <w:rFonts w:cs="Arial"/>
-          <w:sz w:val="28"/>
-          <w:szCs w:val="28"/>
-          <w:rtl/>
-        </w:rPr>
-        <w:t xml:space="preserve"> وأذنتها بالاستدانة والصرف</w:t>
-      </w:r>
-      <w:r>
-        <w:rPr>
-          <w:rFonts w:hint="cs"/>
-          <w:sz w:val="28"/>
-          <w:szCs w:val="28"/>
-          <w:rtl/>
-        </w:rPr>
-        <w:t xml:space="preserve"> </w:t>
-      </w:r>
-      <w:r>
-        <w:rPr>
-          <w:rFonts w:cs="Arial"/>
-          <w:sz w:val="28"/>
-          <w:szCs w:val="28"/>
-          <w:rtl/>
-        </w:rPr>
-        <w:t xml:space="preserve">والرجوع عليه بما يتراكم من النفقة وضمنته الرسوم والمصروفات القانونية حكما وجاهليا بحق المتداعيين قابلا للاستئناف فهمته لهما في المجلس ويجب على الجهة التي يناط بها التنفيذ أن تبادر إليه متى طلب منها وعلى كل سلطة وكل قوة أن تعين على إجرائه ولو باستعمال القوة الجبرية متى طلب منها ذلك طبقا لنصوص </w:t>
-      </w:r>
-      <w:r>
-        <w:rPr>
-          <w:rFonts w:cs="Arial" w:hint="cs"/>
-          <w:sz w:val="28"/>
-          <w:szCs w:val="28"/>
-          <w:rtl/>
-        </w:rPr>
-        <w:t>القانون.</w:t>
-      </w:r>
-      <w:r>
-        <w:rPr>
-          <w:rFonts w:cs="Arial"/>
-          <w:sz w:val="28"/>
-          <w:szCs w:val="28"/>
-          <w:rtl/>
-        </w:rPr>
-        <w:t xml:space="preserve"> وحرر في </w:t>
-      </w:r>
-      <w:r>
-        <w:rPr>
-          <w:rFonts w:cs="Arial"/>
+          <w:rFonts w:asciiTheme="minorBidi" w:hAnsiTheme="minorBidi"/>
+          <w:sz w:val="28"/>
+          <w:szCs w:val="28"/>
+          <w:rtl/>
+        </w:rPr>
+        <w:t xml:space="preserve"> وأذنتها بالاستدانة والصرف والرجوع عليه بما يتراكم من النفقة وضمنته الرسوم والمصروفات القانونية حكما وجاهليا بحق المتداعيين قابلا للاستئناف فهمته لهما في المجلس ويجب على الجهة التي يناط بها التنفيذ أن تبادر إليه متى طلب منها وعلى كل سلطة وكل قوة أن تعين على إجرائه ولو باستعمال القوة الجبرية متى طلب منها ذلك طبقا لنصوص القانون. وحرر في </w:t>
+      </w:r>
+      <w:r>
+        <w:rPr>
+          <w:rFonts w:asciiTheme="minorBidi" w:hAnsiTheme="minorBidi"/>
           <w:sz w:val="28"/>
           <w:szCs w:val="28"/>
         </w:rPr>
@@ -376,16 +279,16 @@
       </w:r>
       <w:r>
         <w:rPr>
-          <w:rFonts w:cs="Arial" w:hint="cs"/>
-          <w:sz w:val="28"/>
-          <w:szCs w:val="28"/>
-          <w:rtl/>
-        </w:rPr>
-        <w:t xml:space="preserve"> </w:t>
-      </w:r>
-      <w:r>
-        <w:rPr>
-          <w:rFonts w:cs="Arial"/>
+          <w:rFonts w:asciiTheme="minorBidi" w:hAnsiTheme="minorBidi"/>
+          <w:sz w:val="28"/>
+          <w:szCs w:val="28"/>
+          <w:rtl/>
+        </w:rPr>
+        <w:t xml:space="preserve"> </w:t>
+      </w:r>
+      <w:r>
+        <w:rPr>
+          <w:rFonts w:asciiTheme="minorBidi" w:hAnsiTheme="minorBidi"/>
           <w:sz w:val="28"/>
           <w:szCs w:val="28"/>
           <w:rtl/>
@@ -394,15 +297,16 @@
       </w:r>
       <w:r>
         <w:rPr>
-          <w:rFonts w:hint="cs"/>
-          <w:sz w:val="28"/>
-          <w:szCs w:val="28"/>
-          <w:rtl/>
-        </w:rPr>
-        <w:t xml:space="preserve"> </w:t>
-      </w:r>
-      <w:r>
-        <w:rPr>
+          <w:rFonts w:asciiTheme="minorBidi" w:hAnsiTheme="minorBidi"/>
+          <w:sz w:val="28"/>
+          <w:szCs w:val="28"/>
+          <w:rtl/>
+        </w:rPr>
+        <w:t xml:space="preserve"> </w:t>
+      </w:r>
+      <w:r>
+        <w:rPr>
+          <w:rFonts w:asciiTheme="minorBidi" w:hAnsiTheme="minorBidi"/>
           <w:sz w:val="28"/>
           <w:szCs w:val="28"/>
         </w:rPr>
@@ -410,16 +314,16 @@
       </w:r>
       <w:r>
         <w:rPr>
-          <w:rFonts w:hint="cs"/>
-          <w:sz w:val="28"/>
-          <w:szCs w:val="28"/>
-          <w:rtl/>
-        </w:rPr>
-        <w:t xml:space="preserve"> </w:t>
-      </w:r>
-      <w:r>
-        <w:rPr>
-          <w:rFonts w:cs="Arial"/>
+          <w:rFonts w:asciiTheme="minorBidi" w:hAnsiTheme="minorBidi"/>
+          <w:sz w:val="28"/>
+          <w:szCs w:val="28"/>
+          <w:rtl/>
+        </w:rPr>
+        <w:t xml:space="preserve"> </w:t>
+      </w:r>
+      <w:r>
+        <w:rPr>
+          <w:rFonts w:asciiTheme="minorBidi" w:hAnsiTheme="minorBidi"/>
           <w:sz w:val="28"/>
           <w:szCs w:val="28"/>
           <w:rtl/>
@@ -430,7 +334,7 @@
     <w:p>
       <w:pPr>
         <w:rPr>
-          <w:rFonts w:cs="Arial"/>
+          <w:rFonts w:asciiTheme="minorBidi" w:hAnsiTheme="minorBidi"/>
           <w:sz w:val="28"/>
           <w:szCs w:val="28"/>
           <w:rtl/>
@@ -440,13 +344,14 @@
     <w:p>
       <w:pPr>
         <w:rPr>
+          <w:rFonts w:asciiTheme="minorBidi" w:hAnsiTheme="minorBidi"/>
           <w:sz w:val="28"/>
           <w:szCs w:val="28"/>
         </w:rPr>
       </w:pPr>
       <w:r>
         <w:rPr>
-          <w:rFonts w:cs="Arial"/>
+          <w:rFonts w:asciiTheme="minorBidi" w:hAnsiTheme="minorBidi"/>
           <w:b/>
           <w:bCs/>
           <w:sz w:val="28"/>
@@ -457,7 +362,7 @@
       </w:r>
       <w:r>
         <w:rPr>
-          <w:rFonts w:cs="Arial" w:hint="cs"/>
+          <w:rFonts w:asciiTheme="minorBidi" w:hAnsiTheme="minorBidi"/>
           <w:b/>
           <w:bCs/>
           <w:sz w:val="28"/>
@@ -468,15 +373,16 @@
       </w:r>
       <w:r>
         <w:rPr>
-          <w:rFonts w:hint="cs"/>
-          <w:sz w:val="28"/>
-          <w:szCs w:val="28"/>
-          <w:rtl/>
-        </w:rPr>
-        <w:t xml:space="preserve"> </w:t>
-      </w:r>
-      <w:r>
-        <w:rPr>
+          <w:rFonts w:asciiTheme="minorBidi" w:hAnsiTheme="minorBidi"/>
+          <w:sz w:val="28"/>
+          <w:szCs w:val="28"/>
+          <w:rtl/>
+        </w:rPr>
+        <w:t xml:space="preserve"> </w:t>
+      </w:r>
+      <w:r>
+        <w:rPr>
+          <w:rFonts w:asciiTheme="minorBidi" w:hAnsiTheme="minorBidi"/>
           <w:sz w:val="28"/>
           <w:szCs w:val="28"/>
         </w:rPr>
@@ -484,16 +390,16 @@
       </w:r>
       <w:r>
         <w:rPr>
-          <w:rFonts w:cs="Arial" w:hint="cs"/>
-          <w:sz w:val="28"/>
-          <w:szCs w:val="28"/>
-          <w:rtl/>
-        </w:rPr>
-        <w:t xml:space="preserve"> </w:t>
-      </w:r>
-      <w:r>
-        <w:rPr>
-          <w:rFonts w:cs="Arial"/>
+          <w:rFonts w:asciiTheme="minorBidi" w:hAnsiTheme="minorBidi"/>
+          <w:sz w:val="28"/>
+          <w:szCs w:val="28"/>
+          <w:rtl/>
+        </w:rPr>
+        <w:t xml:space="preserve"> </w:t>
+      </w:r>
+      <w:r>
+        <w:rPr>
+          <w:rFonts w:asciiTheme="minorBidi" w:hAnsiTheme="minorBidi"/>
           <w:b/>
           <w:bCs/>
           <w:sz w:val="28"/>
@@ -504,7 +410,7 @@
       </w:r>
       <w:r>
         <w:rPr>
-          <w:rFonts w:cs="Arial" w:hint="cs"/>
+          <w:rFonts w:asciiTheme="minorBidi" w:hAnsiTheme="minorBidi"/>
           <w:b/>
           <w:bCs/>
           <w:sz w:val="28"/>
@@ -515,15 +421,16 @@
       </w:r>
       <w:r>
         <w:rPr>
-          <w:rFonts w:hint="cs"/>
-          <w:sz w:val="28"/>
-          <w:szCs w:val="28"/>
-          <w:rtl/>
-        </w:rPr>
-        <w:t xml:space="preserve"> </w:t>
-      </w:r>
-      <w:r>
-        <w:rPr>
+          <w:rFonts w:asciiTheme="minorBidi" w:hAnsiTheme="minorBidi"/>
+          <w:sz w:val="28"/>
+          <w:szCs w:val="28"/>
+          <w:rtl/>
+        </w:rPr>
+        <w:t xml:space="preserve"> </w:t>
+      </w:r>
+      <w:r>
+        <w:rPr>
+          <w:rFonts w:asciiTheme="minorBidi" w:hAnsiTheme="minorBidi"/>
           <w:sz w:val="28"/>
           <w:szCs w:val="28"/>
         </w:rPr>
@@ -531,16 +438,16 @@
       </w:r>
       <w:r>
         <w:rPr>
-          <w:rFonts w:hint="cs"/>
-          <w:sz w:val="28"/>
-          <w:szCs w:val="28"/>
-          <w:rtl/>
-        </w:rPr>
-        <w:t xml:space="preserve"> </w:t>
-      </w:r>
-      <w:r>
-        <w:rPr>
-          <w:rFonts w:cs="Arial"/>
+          <w:rFonts w:asciiTheme="minorBidi" w:hAnsiTheme="minorBidi"/>
+          <w:sz w:val="28"/>
+          <w:szCs w:val="28"/>
+          <w:rtl/>
+        </w:rPr>
+        <w:t xml:space="preserve"> </w:t>
+      </w:r>
+      <w:r>
+        <w:rPr>
+          <w:rFonts w:asciiTheme="minorBidi" w:hAnsiTheme="minorBidi"/>
           <w:b/>
           <w:bCs/>
           <w:sz w:val="28"/>
@@ -551,7 +458,7 @@
       </w:r>
       <w:r>
         <w:rPr>
-          <w:rFonts w:hint="cs"/>
+          <w:rFonts w:asciiTheme="minorBidi" w:hAnsiTheme="minorBidi"/>
           <w:sz w:val="28"/>
           <w:szCs w:val="28"/>
           <w:rtl/>
@@ -560,15 +467,16 @@
       </w:r>
       <w:r>
         <w:rPr>
-          <w:rFonts w:hint="cs"/>
-          <w:sz w:val="28"/>
-          <w:szCs w:val="28"/>
-          <w:rtl/>
-        </w:rPr>
-        <w:t xml:space="preserve"> </w:t>
-      </w:r>
-      <w:r>
-        <w:rPr>
+          <w:rFonts w:asciiTheme="minorBidi" w:hAnsiTheme="minorBidi"/>
+          <w:sz w:val="28"/>
+          <w:szCs w:val="28"/>
+          <w:rtl/>
+        </w:rPr>
+        <w:t xml:space="preserve"> </w:t>
+      </w:r>
+      <w:r>
+        <w:rPr>
+          <w:rFonts w:asciiTheme="minorBidi" w:hAnsiTheme="minorBidi"/>
           <w:sz w:val="28"/>
           <w:szCs w:val="28"/>
         </w:rPr>
@@ -576,16 +484,16 @@
       </w:r>
       <w:r>
         <w:rPr>
-          <w:rFonts w:hint="cs"/>
-          <w:sz w:val="28"/>
-          <w:szCs w:val="28"/>
-          <w:rtl/>
-        </w:rPr>
-        <w:t xml:space="preserve"> </w:t>
-      </w:r>
-      <w:r>
-        <w:rPr>
-          <w:rFonts w:cs="Arial"/>
+          <w:rFonts w:asciiTheme="minorBidi" w:hAnsiTheme="minorBidi"/>
+          <w:sz w:val="28"/>
+          <w:szCs w:val="28"/>
+          <w:rtl/>
+        </w:rPr>
+        <w:t xml:space="preserve"> </w:t>
+      </w:r>
+      <w:r>
+        <w:rPr>
+          <w:rFonts w:asciiTheme="minorBidi" w:hAnsiTheme="minorBidi"/>
           <w:b/>
           <w:bCs/>
           <w:sz w:val="28"/>
@@ -596,7 +504,7 @@
       </w:r>
       <w:r>
         <w:rPr>
-          <w:rFonts w:cs="Arial" w:hint="cs"/>
+          <w:rFonts w:asciiTheme="minorBidi" w:hAnsiTheme="minorBidi"/>
           <w:b/>
           <w:bCs/>
           <w:sz w:val="28"/>
@@ -607,15 +515,16 @@
       </w:r>
       <w:r>
         <w:rPr>
-          <w:rFonts w:hint="cs"/>
-          <w:sz w:val="28"/>
-          <w:szCs w:val="28"/>
-          <w:rtl/>
-        </w:rPr>
-        <w:t xml:space="preserve"> </w:t>
-      </w:r>
-      <w:r>
-        <w:rPr>
+          <w:rFonts w:asciiTheme="minorBidi" w:hAnsiTheme="minorBidi"/>
+          <w:sz w:val="28"/>
+          <w:szCs w:val="28"/>
+          <w:rtl/>
+        </w:rPr>
+        <w:t xml:space="preserve"> </w:t>
+      </w:r>
+      <w:r>
+        <w:rPr>
+          <w:rFonts w:asciiTheme="minorBidi" w:hAnsiTheme="minorBidi"/>
           <w:sz w:val="28"/>
           <w:szCs w:val="28"/>
         </w:rPr>

</xml_diff>